<commit_message>
Update app: 90 added 9 modified 1 deleted [03:07]
</commit_message>
<xml_diff>
--- a/ideal_sequences_of_treatements/sequence de_traitement_ideal_2.docx
+++ b/ideal_sequences_of_treatements/sequence de_traitement_ideal_2.docx
@@ -307,6 +307,9 @@
             <w:pPr>
               <w:jc w:val="center"/>
             </w:pPr>
+            <w:r>
+              <w:t>A faire</w:t>
+            </w:r>
           </w:p>
         </w:tc>
         <w:tc>
@@ -535,6 +538,9 @@
             <w:pPr>
               <w:jc w:val="center"/>
             </w:pPr>
+            <w:r>
+              <w:t>A faire</w:t>
+            </w:r>
           </w:p>
         </w:tc>
         <w:tc>
@@ -752,19 +758,7 @@
               <w:rPr>
                 <w:rFonts w:ascii="Arial" w:hAnsi="Arial" w:cs="Arial"/>
               </w:rPr>
-              <w:t xml:space="preserve">Si </w:t>
-            </w:r>
-            <w:r>
-              <w:rPr>
-                <w:rFonts w:ascii="Arial" w:hAnsi="Arial" w:cs="Arial"/>
-              </w:rPr>
-              <w:t>nécessaire +</w:t>
-            </w:r>
-            <w:r>
-              <w:rPr>
-                <w:rFonts w:ascii="Arial" w:hAnsi="Arial" w:cs="Arial"/>
-              </w:rPr>
-              <w:t xml:space="preserve"> donner curasept </w:t>
+              <w:t xml:space="preserve">Si nécessaire + donner curasept </w:t>
             </w:r>
           </w:p>
         </w:tc>
@@ -898,6 +892,9 @@
             <w:pPr>
               <w:jc w:val="center"/>
             </w:pPr>
+            <w:r>
+              <w:t>A faire</w:t>
+            </w:r>
           </w:p>
         </w:tc>
         <w:tc>
@@ -1126,6 +1123,9 @@
             <w:pPr>
               <w:jc w:val="center"/>
             </w:pPr>
+            <w:r>
+              <w:t>A faire</w:t>
+            </w:r>
           </w:p>
         </w:tc>
         <w:tc>
@@ -1354,6 +1354,9 @@
             <w:pPr>
               <w:jc w:val="center"/>
             </w:pPr>
+            <w:r>
+              <w:t>A faire</w:t>
+            </w:r>
           </w:p>
         </w:tc>
         <w:tc>
@@ -1699,6 +1702,9 @@
             <w:pPr>
               <w:jc w:val="center"/>
             </w:pPr>
+            <w:r>
+              <w:t>A faire</w:t>
+            </w:r>
           </w:p>
         </w:tc>
         <w:tc>
@@ -1927,6 +1933,9 @@
             <w:pPr>
               <w:jc w:val="center"/>
             </w:pPr>
+            <w:r>
+              <w:t>A faire</w:t>
+            </w:r>
           </w:p>
         </w:tc>
         <w:tc>
@@ -2671,6 +2680,9 @@
             <w:pPr>
               <w:jc w:val="center"/>
             </w:pPr>
+            <w:r>
+              <w:t>A faire</w:t>
+            </w:r>
           </w:p>
         </w:tc>
         <w:tc>
@@ -3406,6 +3418,9 @@
             <w:pPr>
               <w:jc w:val="center"/>
             </w:pPr>
+            <w:r>
+              <w:t>A faire</w:t>
+            </w:r>
           </w:p>
         </w:tc>
         <w:tc>
@@ -3633,6 +3648,9 @@
             <w:pPr>
               <w:jc w:val="center"/>
             </w:pPr>
+            <w:r>
+              <w:t>A faire</w:t>
+            </w:r>
           </w:p>
         </w:tc>
         <w:tc>
@@ -3860,6 +3878,9 @@
             <w:pPr>
               <w:jc w:val="center"/>
             </w:pPr>
+            <w:r>
+              <w:t>A faire</w:t>
+            </w:r>
           </w:p>
         </w:tc>
         <w:tc>
@@ -3994,7 +4015,23 @@
                 <w:rFonts w:ascii="Arial" w:hAnsi="Arial" w:cs="Arial"/>
                 <w:lang w:eastAsia="fr-FR"/>
               </w:rPr>
-              <w:t xml:space="preserve">Démonter couronne  + moignon </w:t>
+              <w:t xml:space="preserve">Démonter </w:t>
+            </w:r>
+            <w:proofErr w:type="gramStart"/>
+            <w:r>
+              <w:rPr>
+                <w:rFonts w:ascii="Arial" w:hAnsi="Arial" w:cs="Arial"/>
+                <w:lang w:eastAsia="fr-FR"/>
+              </w:rPr>
+              <w:t>couronne  +</w:t>
+            </w:r>
+            <w:proofErr w:type="gramEnd"/>
+            <w:r>
+              <w:rPr>
+                <w:rFonts w:ascii="Arial" w:hAnsi="Arial" w:cs="Arial"/>
+                <w:lang w:eastAsia="fr-FR"/>
+              </w:rPr>
+              <w:t xml:space="preserve"> moignon </w:t>
             </w:r>
             <w:proofErr w:type="spellStart"/>
             <w:r>
@@ -4455,6 +4492,9 @@
             <w:pPr>
               <w:jc w:val="center"/>
             </w:pPr>
+            <w:r>
+              <w:t>A faire</w:t>
+            </w:r>
           </w:p>
         </w:tc>
         <w:tc>
@@ -5233,14 +5273,7 @@
                 <w:rFonts w:ascii="Arial" w:hAnsi="Arial" w:cs="Arial"/>
                 <w:lang w:val="fr-FR" w:eastAsia="fr-FR"/>
               </w:rPr>
-              <w:t xml:space="preserve">Scellement </w:t>
-            </w:r>
-            <w:r>
-              <w:rPr>
-                <w:rFonts w:ascii="Arial" w:hAnsi="Arial" w:cs="Arial"/>
-                <w:lang w:val="fr-FR" w:eastAsia="fr-FR"/>
-              </w:rPr>
-              <w:t xml:space="preserve">+ empreinte pour gouttière de contention </w:t>
+              <w:t xml:space="preserve">Scellement + empreinte pour gouttière de contention </w:t>
             </w:r>
           </w:p>
         </w:tc>
@@ -5372,21 +5405,7 @@
                 <w:rFonts w:ascii="Arial" w:hAnsi="Arial" w:cs="Arial"/>
                 <w:lang w:val="fr-FR" w:eastAsia="fr-FR"/>
               </w:rPr>
-              <w:t xml:space="preserve"> post op </w:t>
-            </w:r>
-            <w:r>
-              <w:rPr>
-                <w:rFonts w:ascii="Arial" w:hAnsi="Arial" w:cs="Arial"/>
-                <w:lang w:val="fr-FR" w:eastAsia="fr-FR"/>
-              </w:rPr>
-              <w:t xml:space="preserve">+ donner gouttière </w:t>
-            </w:r>
-            <w:r>
-              <w:rPr>
-                <w:rFonts w:ascii="Arial" w:hAnsi="Arial" w:cs="Arial"/>
-                <w:lang w:val="fr-FR" w:eastAsia="fr-FR"/>
-              </w:rPr>
-              <w:t xml:space="preserve">et organiser </w:t>
+              <w:t xml:space="preserve"> post op + donner gouttière et organiser </w:t>
             </w:r>
             <w:proofErr w:type="spellStart"/>
             <w:r>
@@ -5489,6 +5508,9 @@
             <w:pPr>
               <w:jc w:val="center"/>
             </w:pPr>
+            <w:r>
+              <w:t>A faire</w:t>
+            </w:r>
           </w:p>
         </w:tc>
         <w:tc>
@@ -5623,21 +5645,7 @@
                 <w:rFonts w:ascii="Arial" w:hAnsi="Arial" w:cs="Arial"/>
                 <w:lang w:val="fr-FR" w:eastAsia="fr-FR"/>
               </w:rPr>
-              <w:t>Démonter/</w:t>
-            </w:r>
-            <w:r>
-              <w:rPr>
-                <w:rFonts w:ascii="Arial" w:hAnsi="Arial" w:cs="Arial"/>
-                <w:lang w:val="fr-FR" w:eastAsia="fr-FR"/>
-              </w:rPr>
-              <w:t>dévisser couronne</w:t>
-            </w:r>
-            <w:r>
-              <w:rPr>
-                <w:rFonts w:ascii="Arial" w:hAnsi="Arial" w:cs="Arial"/>
-                <w:lang w:val="fr-FR" w:eastAsia="fr-FR"/>
-              </w:rPr>
-              <w:t xml:space="preserve"> + empreinte + provisoire si nécessaire </w:t>
+              <w:t xml:space="preserve">Démonter/dévisser couronne + empreinte + provisoire si nécessaire </w:t>
             </w:r>
           </w:p>
         </w:tc>
@@ -6122,6 +6130,9 @@
             <w:pPr>
               <w:jc w:val="center"/>
             </w:pPr>
+            <w:r>
+              <w:t>A faire</w:t>
+            </w:r>
           </w:p>
         </w:tc>
         <w:tc>
@@ -6252,14 +6263,7 @@
                 <w:rFonts w:ascii="Arial" w:hAnsi="Arial" w:cs="Arial"/>
                 <w:lang w:val="fr-FR" w:eastAsia="fr-FR"/>
               </w:rPr>
-              <w:t xml:space="preserve">Empreinte </w:t>
-            </w:r>
-            <w:r>
-              <w:rPr>
-                <w:rFonts w:ascii="Arial" w:hAnsi="Arial" w:cs="Arial"/>
-                <w:lang w:val="fr-FR" w:eastAsia="fr-FR"/>
-              </w:rPr>
-              <w:t xml:space="preserve">1 arcade </w:t>
+              <w:t xml:space="preserve">Empreinte 1 arcade </w:t>
             </w:r>
           </w:p>
         </w:tc>
@@ -6470,6 +6474,9 @@
             <w:pPr>
               <w:jc w:val="center"/>
             </w:pPr>
+            <w:r>
+              <w:t>A faire</w:t>
+            </w:r>
           </w:p>
         </w:tc>
         <w:tc>
@@ -6604,14 +6611,7 @@
                 <w:rFonts w:ascii="Arial" w:hAnsi="Arial" w:cs="Arial"/>
                 <w:lang w:val="fr-FR" w:eastAsia="fr-FR"/>
               </w:rPr>
-              <w:t xml:space="preserve">Empreinte </w:t>
-            </w:r>
-            <w:r>
-              <w:rPr>
-                <w:rFonts w:ascii="Arial" w:hAnsi="Arial" w:cs="Arial"/>
-                <w:lang w:val="fr-FR" w:eastAsia="fr-FR"/>
-              </w:rPr>
-              <w:t xml:space="preserve">2 arcades + occlusion </w:t>
+              <w:t xml:space="preserve">Empreinte 2 arcades + occlusion </w:t>
             </w:r>
           </w:p>
         </w:tc>
@@ -6728,21 +6728,7 @@
                 <w:rFonts w:ascii="Arial" w:hAnsi="Arial" w:cs="Arial"/>
                 <w:lang w:val="fr-FR" w:eastAsia="fr-FR"/>
               </w:rPr>
-              <w:t>Donner</w:t>
-            </w:r>
-            <w:r>
-              <w:rPr>
-                <w:rFonts w:ascii="Arial" w:hAnsi="Arial" w:cs="Arial"/>
-                <w:lang w:val="fr-FR" w:eastAsia="fr-FR"/>
-              </w:rPr>
-              <w:t xml:space="preserve"> + régler </w:t>
-            </w:r>
-            <w:r>
-              <w:rPr>
-                <w:rFonts w:ascii="Arial" w:hAnsi="Arial" w:cs="Arial"/>
-                <w:lang w:val="fr-FR" w:eastAsia="fr-FR"/>
-              </w:rPr>
-              <w:t xml:space="preserve">gouttière </w:t>
+              <w:t xml:space="preserve">Donner + régler gouttière </w:t>
             </w:r>
           </w:p>
         </w:tc>
@@ -6768,14 +6754,7 @@
                 <w:rFonts w:ascii="Arial" w:hAnsi="Arial" w:cs="Arial"/>
                 <w:lang w:val="fr-FR" w:eastAsia="fr-FR"/>
               </w:rPr>
-              <w:t>30</w:t>
-            </w:r>
-            <w:r>
-              <w:rPr>
-                <w:rFonts w:ascii="Arial" w:hAnsi="Arial" w:cs="Arial"/>
-                <w:lang w:val="fr-FR" w:eastAsia="fr-FR"/>
-              </w:rPr>
-              <w:t xml:space="preserve"> min</w:t>
+              <w:t>30 min</w:t>
             </w:r>
           </w:p>
         </w:tc>
@@ -6843,6 +6822,9 @@
             <w:pPr>
               <w:jc w:val="center"/>
             </w:pPr>
+            <w:r>
+              <w:t>A faire</w:t>
+            </w:r>
           </w:p>
         </w:tc>
         <w:tc>
@@ -7160,42 +7142,7 @@
                 <w:rFonts w:ascii="Arial" w:hAnsi="Arial" w:cs="Arial"/>
                 <w:lang w:val="fr-FR" w:eastAsia="fr-FR"/>
               </w:rPr>
-              <w:t xml:space="preserve">Pose </w:t>
-            </w:r>
-            <w:r>
-              <w:rPr>
-                <w:rFonts w:ascii="Arial" w:hAnsi="Arial" w:cs="Arial"/>
-                <w:lang w:val="fr-FR" w:eastAsia="fr-FR"/>
-              </w:rPr>
-              <w:t>d’implants</w:t>
-            </w:r>
-            <w:r>
-              <w:rPr>
-                <w:rFonts w:ascii="Arial" w:hAnsi="Arial" w:cs="Arial"/>
-                <w:lang w:val="fr-FR" w:eastAsia="fr-FR"/>
-              </w:rPr>
-              <w:t xml:space="preserve"> sup et inf </w:t>
-            </w:r>
-            <w:r>
-              <w:rPr>
-                <w:rFonts w:ascii="Arial" w:hAnsi="Arial" w:cs="Arial"/>
-                <w:lang w:val="fr-FR" w:eastAsia="fr-FR"/>
-              </w:rPr>
-              <w:t xml:space="preserve">(4 + 4) </w:t>
-            </w:r>
-            <w:r>
-              <w:rPr>
-                <w:rFonts w:ascii="Arial" w:hAnsi="Arial" w:cs="Arial"/>
-                <w:lang w:val="fr-FR" w:eastAsia="fr-FR"/>
-              </w:rPr>
-              <w:t xml:space="preserve">avec mise en charge immédiate </w:t>
-            </w:r>
-            <w:r>
-              <w:rPr>
-                <w:rFonts w:ascii="Arial" w:hAnsi="Arial" w:cs="Arial"/>
-                <w:lang w:val="fr-FR" w:eastAsia="fr-FR"/>
-              </w:rPr>
-              <w:t xml:space="preserve">(extractions si nécessaire) </w:t>
+              <w:t xml:space="preserve">Pose d’implants sup et inf (4 + 4) avec mise en charge immédiate (extractions si nécessaire) </w:t>
             </w:r>
           </w:p>
         </w:tc>
@@ -7598,21 +7545,7 @@
                 <w:rFonts w:ascii="Arial" w:hAnsi="Arial" w:cs="Arial"/>
                 <w:lang w:val="fr-FR" w:eastAsia="fr-FR"/>
               </w:rPr>
-              <w:t xml:space="preserve">Empreinte </w:t>
-            </w:r>
-            <w:r>
-              <w:rPr>
-                <w:rFonts w:ascii="Arial" w:hAnsi="Arial" w:cs="Arial"/>
-                <w:lang w:val="fr-FR" w:eastAsia="fr-FR"/>
-              </w:rPr>
-              <w:t>définitive</w:t>
-            </w:r>
-            <w:r>
-              <w:rPr>
-                <w:rFonts w:ascii="Arial" w:hAnsi="Arial" w:cs="Arial"/>
-                <w:lang w:val="fr-FR" w:eastAsia="fr-FR"/>
-              </w:rPr>
-              <w:t xml:space="preserve"> </w:t>
+              <w:t xml:space="preserve">Empreinte définitive </w:t>
             </w:r>
           </w:p>
         </w:tc>
@@ -8122,6 +8055,9 @@
             <w:pPr>
               <w:jc w:val="center"/>
             </w:pPr>
+            <w:r>
+              <w:t>A faire</w:t>
+            </w:r>
           </w:p>
         </w:tc>
         <w:tc>
@@ -9147,6 +9083,9 @@
             <w:pPr>
               <w:jc w:val="center"/>
             </w:pPr>
+            <w:r>
+              <w:t>A faire</w:t>
+            </w:r>
           </w:p>
         </w:tc>
         <w:tc>
@@ -9513,6 +9452,9 @@
             <w:pPr>
               <w:jc w:val="center"/>
             </w:pPr>
+            <w:r>
+              <w:t>A faire</w:t>
+            </w:r>
           </w:p>
         </w:tc>
         <w:tc>
@@ -9879,6 +9821,9 @@
             <w:pPr>
               <w:jc w:val="center"/>
             </w:pPr>
+            <w:r>
+              <w:t>A faire</w:t>
+            </w:r>
           </w:p>
         </w:tc>
         <w:tc>
@@ -10245,6 +10190,9 @@
             <w:pPr>
               <w:jc w:val="center"/>
             </w:pPr>
+            <w:r>
+              <w:t>A faire</w:t>
+            </w:r>
           </w:p>
         </w:tc>
         <w:tc>
@@ -10611,6 +10559,9 @@
             <w:pPr>
               <w:jc w:val="center"/>
             </w:pPr>
+            <w:r>
+              <w:t>A faire</w:t>
+            </w:r>
           </w:p>
         </w:tc>
         <w:tc>
@@ -10753,21 +10704,7 @@
                 <w:rFonts w:ascii="Arial" w:hAnsi="Arial" w:cs="Arial"/>
                 <w:lang w:val="fr-FR" w:eastAsia="fr-FR"/>
               </w:rPr>
-              <w:t>désobtur</w:t>
-            </w:r>
-            <w:r>
-              <w:rPr>
-                <w:rFonts w:ascii="Arial" w:hAnsi="Arial" w:cs="Arial"/>
-                <w:lang w:val="fr-FR" w:eastAsia="fr-FR"/>
-              </w:rPr>
-              <w:t>at</w:t>
-            </w:r>
-            <w:r>
-              <w:rPr>
-                <w:rFonts w:ascii="Arial" w:hAnsi="Arial" w:cs="Arial"/>
-                <w:lang w:val="fr-FR" w:eastAsia="fr-FR"/>
-              </w:rPr>
-              <w:t>ion</w:t>
+              <w:t>désobturation</w:t>
             </w:r>
             <w:proofErr w:type="spellEnd"/>
             <w:r>
@@ -10892,21 +10829,7 @@
                 <w:rFonts w:ascii="Arial" w:hAnsi="Arial" w:cs="Arial"/>
                 <w:lang w:val="fr-FR" w:eastAsia="fr-FR"/>
               </w:rPr>
-              <w:t xml:space="preserve">TR </w:t>
-            </w:r>
-            <w:r>
-              <w:rPr>
-                <w:rFonts w:ascii="Arial" w:hAnsi="Arial" w:cs="Arial"/>
-                <w:lang w:val="fr-FR" w:eastAsia="fr-FR"/>
-              </w:rPr>
-              <w:t>séance</w:t>
-            </w:r>
-            <w:r>
-              <w:rPr>
-                <w:rFonts w:ascii="Arial" w:hAnsi="Arial" w:cs="Arial"/>
-                <w:lang w:val="fr-FR" w:eastAsia="fr-FR"/>
-              </w:rPr>
-              <w:t xml:space="preserve"> 2 obturation + </w:t>
+              <w:t xml:space="preserve">TR séance 2 obturation + </w:t>
             </w:r>
             <w:proofErr w:type="spellStart"/>
             <w:r>
@@ -11022,6 +10945,9 @@
             <w:pPr>
               <w:jc w:val="center"/>
             </w:pPr>
+            <w:r>
+              <w:t>A faire</w:t>
+            </w:r>
           </w:p>
         </w:tc>
         <w:tc>
@@ -11389,6 +11315,9 @@
             <w:pPr>
               <w:jc w:val="center"/>
             </w:pPr>
+            <w:r>
+              <w:t>A faire</w:t>
+            </w:r>
           </w:p>
         </w:tc>
         <w:tc>
@@ -11756,6 +11685,9 @@
             <w:pPr>
               <w:jc w:val="center"/>
             </w:pPr>
+            <w:r>
+              <w:t>A faire</w:t>
+            </w:r>
           </w:p>
         </w:tc>
         <w:tc>
@@ -12614,6 +12546,9 @@
             <w:pPr>
               <w:jc w:val="center"/>
             </w:pPr>
+            <w:r>
+              <w:t>A faire</w:t>
+            </w:r>
           </w:p>
         </w:tc>
         <w:tc>
@@ -13248,6 +13183,9 @@
             <w:pPr>
               <w:jc w:val="center"/>
             </w:pPr>
+            <w:r>
+              <w:t>A faire</w:t>
+            </w:r>
           </w:p>
         </w:tc>
         <w:tc>
@@ -14092,6 +14030,9 @@
             <w:pPr>
               <w:jc w:val="center"/>
             </w:pPr>
+            <w:r>
+              <w:t>A faire</w:t>
+            </w:r>
           </w:p>
         </w:tc>
         <w:tc>
@@ -14734,6 +14675,9 @@
             <w:pPr>
               <w:jc w:val="center"/>
             </w:pPr>
+            <w:r>
+              <w:t>A faire</w:t>
+            </w:r>
           </w:p>
         </w:tc>
         <w:tc>
@@ -15030,7 +14974,23 @@
                 <w:rFonts w:ascii="Arial" w:hAnsi="Arial" w:cs="Arial"/>
                 <w:lang w:eastAsia="fr-FR"/>
               </w:rPr>
-              <w:t xml:space="preserve">. avec le produit </w:t>
+              <w:t xml:space="preserve">. </w:t>
+            </w:r>
+            <w:proofErr w:type="gramStart"/>
+            <w:r>
+              <w:rPr>
+                <w:rFonts w:ascii="Arial" w:hAnsi="Arial" w:cs="Arial"/>
+                <w:lang w:eastAsia="fr-FR"/>
+              </w:rPr>
+              <w:t>avec</w:t>
+            </w:r>
+            <w:proofErr w:type="gramEnd"/>
+            <w:r>
+              <w:rPr>
+                <w:rFonts w:ascii="Arial" w:hAnsi="Arial" w:cs="Arial"/>
+                <w:lang w:eastAsia="fr-FR"/>
+              </w:rPr>
+              <w:t xml:space="preserve"> le produit </w:t>
             </w:r>
           </w:p>
         </w:tc>
@@ -15130,6 +15090,9 @@
             <w:pPr>
               <w:jc w:val="center"/>
             </w:pPr>
+            <w:r>
+              <w:t>A faire</w:t>
+            </w:r>
           </w:p>
         </w:tc>
         <w:tc>
@@ -15525,6 +15488,9 @@
             <w:pPr>
               <w:jc w:val="center"/>
             </w:pPr>
+            <w:r>
+              <w:t>A faire</w:t>
+            </w:r>
           </w:p>
         </w:tc>
         <w:tc>
@@ -15544,6 +15510,7 @@
                 <w:lang w:val="fr-FR" w:eastAsia="fr-FR"/>
               </w:rPr>
             </w:pPr>
+            <w:proofErr w:type="gramStart"/>
             <w:r>
               <w:rPr>
                 <w:rFonts w:ascii="Arial" w:hAnsi="Arial" w:cs="Arial"/>
@@ -15551,6 +15518,7 @@
               </w:rPr>
               <w:t>Micro abrasion</w:t>
             </w:r>
+            <w:proofErr w:type="gramEnd"/>
           </w:p>
         </w:tc>
         <w:tc>
@@ -15782,28 +15750,7 @@
                 <w:rFonts w:ascii="Arial" w:hAnsi="Arial" w:cs="Arial"/>
                 <w:lang w:val="fr-FR" w:eastAsia="fr-FR"/>
               </w:rPr>
-              <w:t xml:space="preserve">Microabrasion </w:t>
-            </w:r>
-            <w:r>
-              <w:rPr>
-                <w:rFonts w:ascii="Arial" w:hAnsi="Arial" w:cs="Arial"/>
-                <w:lang w:val="fr-FR" w:eastAsia="fr-FR"/>
-              </w:rPr>
-              <w:t>séance</w:t>
-            </w:r>
-            <w:r>
-              <w:rPr>
-                <w:rFonts w:ascii="Arial" w:hAnsi="Arial" w:cs="Arial"/>
-                <w:lang w:val="fr-FR" w:eastAsia="fr-FR"/>
-              </w:rPr>
-              <w:t xml:space="preserve"> </w:t>
-            </w:r>
-            <w:r>
-              <w:rPr>
-                <w:rFonts w:ascii="Arial" w:hAnsi="Arial" w:cs="Arial"/>
-                <w:lang w:val="fr-FR" w:eastAsia="fr-FR"/>
-              </w:rPr>
-              <w:t>2</w:t>
+              <w:t>Microabrasion séance 2</w:t>
             </w:r>
           </w:p>
         </w:tc>
@@ -15903,6 +15850,9 @@
             <w:pPr>
               <w:jc w:val="center"/>
             </w:pPr>
+            <w:r>
+              <w:t>A faire</w:t>
+            </w:r>
           </w:p>
         </w:tc>
         <w:tc>
@@ -16260,6 +16210,9 @@
             <w:pPr>
               <w:jc w:val="center"/>
             </w:pPr>
+            <w:r>
+              <w:t>A faire</w:t>
+            </w:r>
           </w:p>
         </w:tc>
         <w:tc>
@@ -16740,6 +16693,9 @@
             <w:pPr>
               <w:jc w:val="center"/>
             </w:pPr>
+            <w:r>
+              <w:t>A faire</w:t>
+            </w:r>
           </w:p>
         </w:tc>
         <w:tc>
@@ -17100,6 +17056,9 @@
             <w:pPr>
               <w:jc w:val="center"/>
             </w:pPr>
+            <w:r>
+              <w:t>A faire</w:t>
+            </w:r>
           </w:p>
         </w:tc>
         <w:tc>
@@ -17535,13 +17494,7 @@
               <w:rPr>
                 <w:rFonts w:ascii="Arial" w:hAnsi="Arial" w:cs="Arial"/>
               </w:rPr>
-              <w:t>3</w:t>
-            </w:r>
-            <w:r>
-              <w:rPr>
-                <w:rFonts w:ascii="Arial" w:hAnsi="Arial" w:cs="Arial"/>
-              </w:rPr>
-              <w:t xml:space="preserve"> mois</w:t>
+              <w:t>3 mois</w:t>
             </w:r>
           </w:p>
         </w:tc>
@@ -18169,7 +18122,15 @@
         <w:color w:val="7F7F7F" w:themeColor="text1" w:themeTint="80"/>
         <w:lang w:val="en-US"/>
       </w:rPr>
-      <w:t>15 Bd. Helvé</w:t>
+      <w:t xml:space="preserve">15 Bd. </w:t>
+    </w:r>
+    <w:proofErr w:type="spellStart"/>
+    <w:r>
+      <w:rPr>
+        <w:color w:val="7F7F7F" w:themeColor="text1" w:themeTint="80"/>
+        <w:lang w:val="en-US"/>
+      </w:rPr>
+      <w:t>Helvé</w:t>
     </w:r>
     <w:r>
       <w:rPr>
@@ -18178,6 +18139,7 @@
       </w:rPr>
       <w:t>tique</w:t>
     </w:r>
+    <w:proofErr w:type="spellEnd"/>
     <w:r>
       <w:rPr>
         <w:color w:val="7F7F7F" w:themeColor="text1" w:themeTint="80"/>

</xml_diff>